<commit_message>
docs: populate bugs and troubleshooting tables for weeks 05 to 10 reports
</commit_message>
<xml_diff>
--- a/Week05/Week05_BaoCaoNhom.docx
+++ b/Week05/Week05_BaoCaoNhom.docx
@@ -4737,7 +4737,7 @@
                 <ns0:sz ns0:val="24"/>
                 <ns0:szCs ns0:val="24"/>
               </ns0:rPr>
-              <ns0:t xml:space="preserve"/>
+              <ns0:t xml:space="preserve">Lỗi input tìm kiếm SearchBar bị mất viền đỏ cảnh báo khi từ khóa không hợp lệ nhưng người dùng nhấn gửi nhiều lần.</ns0:t>
             </ns0:r>
           </ns0:p>
         </ns0:tc>
@@ -4770,7 +4770,7 @@
                 <ns0:sz ns0:val="24"/>
                 <ns0:szCs ns0:val="24"/>
               </ns0:rPr>
-              <ns0:t xml:space="preserve"/>
+              <ns0:t xml:space="preserve">Thuộc tính isInvalid của Form.Control không được cập nhật do thiếu hàm check điều kiện validate mỗi khi submit form.</ns0:t>
             </ns0:r>
           </ns0:p>
         </ns0:tc>
@@ -4803,7 +4803,7 @@
                 <ns0:sz ns0:val="24"/>
                 <ns0:szCs ns0:val="24"/>
               </ns0:rPr>
-              <ns0:t xml:space="preserve"/>
+              <ns0:t xml:space="preserve">Bổ sung kiểm tra độ dài từ khóa trong hàm handleSubmit và cập nhật state error đúng cách.</ns0:t>
             </ns0:r>
           </ns0:p>
         </ns0:tc>
@@ -4836,7 +4836,7 @@
                 <ns0:sz ns0:val="24"/>
                 <ns0:szCs ns0:val="24"/>
               </ns0:rPr>
-              <ns0:t xml:space="preserve"/>
+              <ns0:t xml:space="preserve">Đã fix</ns0:t>
             </ns0:r>
           </ns0:p>
         </ns0:tc>
@@ -4904,7 +4904,7 @@
                 <ns0:sz ns0:val="24"/>
                 <ns0:szCs ns0:val="24"/>
               </ns0:rPr>
-              <ns0:t xml:space="preserve"/>
+              <ns0:t xml:space="preserve">Lỗi bảng quản trị Admin bị tràn màn hình ngang (overflow-x) khi hiển thị trên các thiết bị di động hẹp (375px).</ns0:t>
             </ns0:r>
           </ns0:p>
         </ns0:tc>
@@ -4937,7 +4937,7 @@
                 <ns0:sz ns0:val="24"/>
                 <ns0:szCs ns0:val="24"/>
               </ns0:rPr>
-              <ns0:t xml:space="preserve"/>
+              <ns0:t xml:space="preserve">Bảng Table của React-Bootstrap mặc định không có thanh cuộn ngang tự động nếu không khai báo thuộc tính responsive.</ns0:t>
             </ns0:r>
           </ns0:p>
         </ns0:tc>
@@ -4970,7 +4970,7 @@
                 <ns0:sz ns0:val="24"/>
                 <ns0:szCs ns0:val="24"/>
               </ns0:rPr>
-              <ns0:t xml:space="preserve"/>
+              <ns0:t xml:space="preserve">Thêm thuộc tính responsive vào thẻ Table (&lt;Table responsive ...&gt;) để tự tạo thanh cuộn ngang.</ns0:t>
             </ns0:r>
           </ns0:p>
         </ns0:tc>
@@ -5003,7 +5003,7 @@
                 <ns0:sz ns0:val="24"/>
                 <ns0:szCs ns0:val="24"/>
               </ns0:rPr>
-              <ns0:t xml:space="preserve"/>
+              <ns0:t xml:space="preserve">Đã fix</ns0:t>
             </ns0:r>
           </ns0:p>
         </ns0:tc>

</xml_diff>